<commit_message>
simplify README for user workflow
</commit_message>
<xml_diff>
--- a/materials/word/参考文献包.docx
+++ b/materials/word/参考文献包.docx
@@ -30,11 +30,99 @@
       </w:r>
     </w:p>
     <w:p>
+      <w:r>
+        <w:rPr>
+          <w:b/>
+        </w:rPr>
+        <w:t xml:space="preserve">1. </w:t>
+      </w:r>
+      <w:r>
+        <w:t>Gioia, D. A., Corley, K. G., &amp; Hamilton, A. L.. (2013). Seeking Qualitative Rigor in Inductive Research: Notes on the Gioia Methodology. Organizational Research Methods. https://doi.org/10.1177/1094428112452151</w:t>
+      </w:r>
+    </w:p>
+    <w:p>
+      <w:r>
+        <w:rPr>
+          <w:b/>
+        </w:rPr>
+        <w:t xml:space="preserve">2. </w:t>
+      </w:r>
+      <w:r>
+        <w:t>Bascle, G.. (2008). Controlling for endogeneity with instrumental variables in strategic management research. Strategic Organization. https://doi.org/10.1177/1476127008094339</w:t>
+      </w:r>
+    </w:p>
+    <w:p>
+      <w:r>
+        <w:rPr>
+          <w:b/>
+        </w:rPr>
+        <w:t xml:space="preserve">3. </w:t>
+      </w:r>
+      <w:r>
+        <w:t>Paschmann, J. W., Bruno, H. A., Heerde, H. J. V., Völckner, F., &amp; Klein, K.. (2025). Driving Mobile App User Engagement Through Gamification. Journal of Marketing Research. https://doi.org/10.1177/00222437241275927</w:t>
+      </w:r>
+    </w:p>
+    <w:p>
+      <w:r>
+        <w:rPr>
+          <w:b/>
+        </w:rPr>
+        <w:t xml:space="preserve">4. </w:t>
+      </w:r>
+      <w:r>
+        <w:t>Hünermund, P., &amp; Louw, B.. (2025). On the Nuisance of Control Variables in Causal Regression Analysis. Organizational Research Methods. https://doi.org/10.1177/10944281231219274</w:t>
+      </w:r>
+    </w:p>
+    <w:p>
       <w:pPr>
         <w:pStyle w:val="Heading1"/>
       </w:pPr>
       <w:r>
         <w:t>二、GB/T 7714 引用格式</w:t>
+      </w:r>
+    </w:p>
+    <w:p>
+      <w:r>
+        <w:rPr>
+          <w:b/>
+        </w:rPr>
+        <w:t xml:space="preserve">[1] </w:t>
+      </w:r>
+      <w:r>
+        <w:t>Dennis A. Gioia, Kevin G. Corley, Aimee L. Hamilton. Seeking Qualitative Rigor in Inductive Research: Notes on the Gioia Methodology[J]. Organizational Research Methods, 2013. DOI: 10.1177/1094428112452151.</w:t>
+      </w:r>
+    </w:p>
+    <w:p>
+      <w:r>
+        <w:rPr>
+          <w:b/>
+        </w:rPr>
+        <w:t xml:space="preserve">[2] </w:t>
+      </w:r>
+      <w:r>
+        <w:t>Guilhem Bascle. Controlling for endogeneity with instrumental variables in strategic management research[J]. Strategic Organization, 2008. DOI: 10.1177/1476127008094339.</w:t>
+      </w:r>
+    </w:p>
+    <w:p>
+      <w:r>
+        <w:rPr>
+          <w:b/>
+        </w:rPr>
+        <w:t xml:space="preserve">[3] </w:t>
+      </w:r>
+      <w:r>
+        <w:t>Jens W. Paschmann, Hernán A. Bruno, Harald J. Van Heerde, 等. Driving Mobile App User Engagement Through Gamification[J]. Journal of Marketing Research, 2025. DOI: 10.1177/00222437241275927.</w:t>
+      </w:r>
+    </w:p>
+    <w:p>
+      <w:r>
+        <w:rPr>
+          <w:b/>
+        </w:rPr>
+        <w:t xml:space="preserve">[4] </w:t>
+      </w:r>
+      <w:r>
+        <w:t>Paul Hünermund, Beyers Louw. On the Nuisance of Control Variables in Causal Regression Analysis[J]. Organizational Research Methods, 2025. DOI: 10.1177/10944281231219274.</w:t>
       </w:r>
     </w:p>
     <w:p>
@@ -106,6 +194,214 @@
           <w:p>
             <w:r>
               <w:t>DOI</w:t>
+            </w:r>
+          </w:p>
+        </w:tc>
+      </w:tr>
+      <w:tr>
+        <w:tc>
+          <w:tcPr>
+            <w:tcW w:type="dxa" w:w="1728"/>
+          </w:tcPr>
+          <w:p>
+            <w:r>
+              <w:t>1</w:t>
+            </w:r>
+          </w:p>
+        </w:tc>
+        <w:tc>
+          <w:tcPr>
+            <w:tcW w:type="dxa" w:w="1728"/>
+          </w:tcPr>
+          <w:p>
+            <w:r>
+              <w:t>Seeking Qualitative Rigor in Inductive Research: Notes on the Gioia Methodology</w:t>
+            </w:r>
+          </w:p>
+        </w:tc>
+        <w:tc>
+          <w:tcPr>
+            <w:tcW w:type="dxa" w:w="1728"/>
+          </w:tcPr>
+          <w:p>
+            <w:r>
+              <w:t>Dennis A. Gioia; Kevin G. Corley; Aimee L. Hamilton</w:t>
+            </w:r>
+          </w:p>
+        </w:tc>
+        <w:tc>
+          <w:tcPr>
+            <w:tcW w:type="dxa" w:w="1728"/>
+          </w:tcPr>
+          <w:p>
+            <w:r>
+              <w:t>2013</w:t>
+            </w:r>
+          </w:p>
+        </w:tc>
+        <w:tc>
+          <w:tcPr>
+            <w:tcW w:type="dxa" w:w="1728"/>
+          </w:tcPr>
+          <w:p>
+            <w:r>
+              <w:t>10.1177/1094428112452151</w:t>
+            </w:r>
+          </w:p>
+        </w:tc>
+      </w:tr>
+      <w:tr>
+        <w:tc>
+          <w:tcPr>
+            <w:tcW w:type="dxa" w:w="1728"/>
+          </w:tcPr>
+          <w:p>
+            <w:r>
+              <w:t>2</w:t>
+            </w:r>
+          </w:p>
+        </w:tc>
+        <w:tc>
+          <w:tcPr>
+            <w:tcW w:type="dxa" w:w="1728"/>
+          </w:tcPr>
+          <w:p>
+            <w:r>
+              <w:t>Controlling for endogeneity with instrumental variables in strategic management research</w:t>
+            </w:r>
+          </w:p>
+        </w:tc>
+        <w:tc>
+          <w:tcPr>
+            <w:tcW w:type="dxa" w:w="1728"/>
+          </w:tcPr>
+          <w:p>
+            <w:r>
+              <w:t>Guilhem Bascle</w:t>
+            </w:r>
+          </w:p>
+        </w:tc>
+        <w:tc>
+          <w:tcPr>
+            <w:tcW w:type="dxa" w:w="1728"/>
+          </w:tcPr>
+          <w:p>
+            <w:r>
+              <w:t>2008</w:t>
+            </w:r>
+          </w:p>
+        </w:tc>
+        <w:tc>
+          <w:tcPr>
+            <w:tcW w:type="dxa" w:w="1728"/>
+          </w:tcPr>
+          <w:p>
+            <w:r>
+              <w:t>10.1177/1476127008094339</w:t>
+            </w:r>
+          </w:p>
+        </w:tc>
+      </w:tr>
+      <w:tr>
+        <w:tc>
+          <w:tcPr>
+            <w:tcW w:type="dxa" w:w="1728"/>
+          </w:tcPr>
+          <w:p>
+            <w:r>
+              <w:t>3</w:t>
+            </w:r>
+          </w:p>
+        </w:tc>
+        <w:tc>
+          <w:tcPr>
+            <w:tcW w:type="dxa" w:w="1728"/>
+          </w:tcPr>
+          <w:p>
+            <w:r>
+              <w:t>Driving Mobile App User Engagement Through Gamification</w:t>
+            </w:r>
+          </w:p>
+        </w:tc>
+        <w:tc>
+          <w:tcPr>
+            <w:tcW w:type="dxa" w:w="1728"/>
+          </w:tcPr>
+          <w:p>
+            <w:r>
+              <w:t>Jens W. Paschmann; Hernán A. Bruno; Harald J. Van Heerde; Franziska Völckner; Kristina Klein</w:t>
+            </w:r>
+          </w:p>
+        </w:tc>
+        <w:tc>
+          <w:tcPr>
+            <w:tcW w:type="dxa" w:w="1728"/>
+          </w:tcPr>
+          <w:p>
+            <w:r>
+              <w:t>2025</w:t>
+            </w:r>
+          </w:p>
+        </w:tc>
+        <w:tc>
+          <w:tcPr>
+            <w:tcW w:type="dxa" w:w="1728"/>
+          </w:tcPr>
+          <w:p>
+            <w:r>
+              <w:t>10.1177/00222437241275927</w:t>
+            </w:r>
+          </w:p>
+        </w:tc>
+      </w:tr>
+      <w:tr>
+        <w:tc>
+          <w:tcPr>
+            <w:tcW w:type="dxa" w:w="1728"/>
+          </w:tcPr>
+          <w:p>
+            <w:r>
+              <w:t>4</w:t>
+            </w:r>
+          </w:p>
+        </w:tc>
+        <w:tc>
+          <w:tcPr>
+            <w:tcW w:type="dxa" w:w="1728"/>
+          </w:tcPr>
+          <w:p>
+            <w:r>
+              <w:t>On the Nuisance of Control Variables in Causal Regression Analysis</w:t>
+            </w:r>
+          </w:p>
+        </w:tc>
+        <w:tc>
+          <w:tcPr>
+            <w:tcW w:type="dxa" w:w="1728"/>
+          </w:tcPr>
+          <w:p>
+            <w:r>
+              <w:t>Paul Hünermund; Beyers Louw</w:t>
+            </w:r>
+          </w:p>
+        </w:tc>
+        <w:tc>
+          <w:tcPr>
+            <w:tcW w:type="dxa" w:w="1728"/>
+          </w:tcPr>
+          <w:p>
+            <w:r>
+              <w:t>2025</w:t>
+            </w:r>
+          </w:p>
+        </w:tc>
+        <w:tc>
+          <w:tcPr>
+            <w:tcW w:type="dxa" w:w="1728"/>
+          </w:tcPr>
+          <w:p>
+            <w:r>
+              <w:t>10.1177/10944281231219274</w:t>
             </w:r>
           </w:p>
         </w:tc>

</xml_diff>